<commit_message>
Update verse and passwords
</commit_message>
<xml_diff>
--- a/Staff_and_Booth_Organizer_Manual.docx
+++ b/Staff_and_Booth_Organizer_Manual.docx
@@ -318,7 +318,198 @@
         <w:rPr>
           <w:color w:val="243447"/>
         </w:rPr>
-        <w:t xml:space="preserve"> or the booth you are leading, then enter the shared organizer key. Do not give the staff link or key to attendees.</w:t>
+        <w:t xml:space="preserve"> or the booth you are leading, then enter that role's password. Each booth password opens only its own booth, and the Overall Organizer password does not open booth portals. Give each leader only the password they need; do not give the staff link or any staff password to attendees.</w:t>
+      </w:r>
+    </w:p>
+    <w:p>
+      <w:pPr>
+        <w:pStyle w:val="Heading2"/>
+      </w:pPr>
+      <w:r>
+        <w:rPr>
+          <w:color w:val="1F4D78"/>
+        </w:rPr>
+        <w:t>Password setup for the technical owner</w:t>
+      </w:r>
+    </w:p>
+    <w:p>
+      <w:r>
+        <w:rPr>
+          <w:color w:val="243447"/>
+        </w:rPr>
+        <w:t>Render uses six unique server-only variables:</w:t>
+      </w:r>
+    </w:p>
+    <w:p>
+      <w:pPr>
+        <w:pStyle w:val="CodeBlock"/>
+        <w:shd w:fill="F5F7FA"/>
+        <w:pBdr>
+          <w:left w:val="single" w:sz="18" w:space="8" w:color="E8EEF5"/>
+        </w:pBdr>
+      </w:pPr>
+      <w:r>
+        <w:t>EVENT_APP_ORGANIZER_KEY=Overall Organizer only</w:t>
+        <w:br/>
+      </w:r>
+      <w:r>
+        <w:t>EVENT_APP_DRAW_HEAVEN_KEY=Draw Heaven only</w:t>
+        <w:br/>
+      </w:r>
+      <w:r>
+        <w:t>EVENT_APP_BIBLE_BOWL_KEY=Bible Bowl only</w:t>
+        <w:br/>
+      </w:r>
+      <w:r>
+        <w:t>EVENT_APP_HEAVEN_BOOTH_KEY=The Heaven Booth only</w:t>
+        <w:br/>
+      </w:r>
+      <w:r>
+        <w:t>EVENT_APP_ART_THERAPY_KEY=Art Therapy only</w:t>
+        <w:br/>
+      </w:r>
+      <w:r>
+        <w:t>EVENT_APP_NEW_SONG_KEY=New Song only</w:t>
+      </w:r>
+    </w:p>
+    <w:p>
+      <w:r>
+        <w:rPr>
+          <w:color w:val="243447"/>
+        </w:rPr>
+        <w:t xml:space="preserve">For an existing deployment, keep the current </w:t>
+      </w:r>
+      <w:r>
+        <w:rPr>
+          <w:rFonts w:ascii="Consolas" w:hAnsi="Consolas"/>
+          <w:color w:val="1F4D78"/>
+          <w:sz w:val="18"/>
+        </w:rPr>
+        <w:t>EVENT_APP_ORGANIZER_KEY</w:t>
+      </w:r>
+      <w:r>
+        <w:rPr>
+          <w:color w:val="243447"/>
+        </w:rPr>
+        <w:t xml:space="preserve"> value for Overall Organizer. </w:t>
+      </w:r>
+      <w:r>
+        <w:rPr>
+          <w:b/>
+          <w:color w:val="243447"/>
+        </w:rPr>
+        <w:t>Before deploying the updated code</w:t>
+      </w:r>
+      <w:r>
+        <w:rPr>
+          <w:color w:val="243447"/>
+        </w:rPr>
+        <w:t xml:space="preserve">, add the other five variables with different strong values. Choose </w:t>
+      </w:r>
+      <w:r>
+        <w:rPr>
+          <w:b/>
+          <w:color w:val="243447"/>
+        </w:rPr>
+        <w:t>Save and deploy</w:t>
+      </w:r>
+      <w:r>
+        <w:rPr>
+          <w:color w:val="243447"/>
+        </w:rPr>
+        <w:t>, then distribute each booth password privately to that booth's leader. A missing hosted value disables only that portal; there is no shared or Overall-password fallback, and values must not be reused between roles. Open staff tabs must enter their password again after deployment.</w:t>
+      </w:r>
+    </w:p>
+    <w:p>
+      <w:r>
+        <w:rPr>
+          <w:color w:val="243447"/>
+        </w:rPr>
+        <w:t xml:space="preserve">No link changes are required. This password update does not alter attendee data, the persistent database, or the Google Sheets credentials or tab layout. Local-only defaults are </w:t>
+      </w:r>
+      <w:r>
+        <w:rPr>
+          <w:rFonts w:ascii="Consolas" w:hAnsi="Consolas"/>
+          <w:color w:val="1F4D78"/>
+          <w:sz w:val="18"/>
+        </w:rPr>
+        <w:t>demo</w:t>
+      </w:r>
+      <w:r>
+        <w:rPr>
+          <w:color w:val="243447"/>
+        </w:rPr>
+        <w:t xml:space="preserve">, </w:t>
+      </w:r>
+      <w:r>
+        <w:rPr>
+          <w:rFonts w:ascii="Consolas" w:hAnsi="Consolas"/>
+          <w:color w:val="1F4D78"/>
+          <w:sz w:val="18"/>
+        </w:rPr>
+        <w:t>demo-draw-heaven</w:t>
+      </w:r>
+      <w:r>
+        <w:rPr>
+          <w:color w:val="243447"/>
+        </w:rPr>
+        <w:t xml:space="preserve">, </w:t>
+      </w:r>
+      <w:r>
+        <w:rPr>
+          <w:rFonts w:ascii="Consolas" w:hAnsi="Consolas"/>
+          <w:color w:val="1F4D78"/>
+          <w:sz w:val="18"/>
+        </w:rPr>
+        <w:t>demo-bible-bowl</w:t>
+      </w:r>
+      <w:r>
+        <w:rPr>
+          <w:color w:val="243447"/>
+        </w:rPr>
+        <w:t xml:space="preserve">, </w:t>
+      </w:r>
+      <w:r>
+        <w:rPr>
+          <w:rFonts w:ascii="Consolas" w:hAnsi="Consolas"/>
+          <w:color w:val="1F4D78"/>
+          <w:sz w:val="18"/>
+        </w:rPr>
+        <w:t>demo-heaven-booth</w:t>
+      </w:r>
+      <w:r>
+        <w:rPr>
+          <w:color w:val="243447"/>
+        </w:rPr>
+        <w:t xml:space="preserve">, </w:t>
+      </w:r>
+      <w:r>
+        <w:rPr>
+          <w:rFonts w:ascii="Consolas" w:hAnsi="Consolas"/>
+          <w:color w:val="1F4D78"/>
+          <w:sz w:val="18"/>
+        </w:rPr>
+        <w:t>demo-art-therapy</w:t>
+      </w:r>
+      <w:r>
+        <w:rPr>
+          <w:color w:val="243447"/>
+        </w:rPr>
+        <w:t xml:space="preserve">, and </w:t>
+      </w:r>
+      <w:r>
+        <w:rPr>
+          <w:rFonts w:ascii="Consolas" w:hAnsi="Consolas"/>
+          <w:color w:val="1F4D78"/>
+          <w:sz w:val="18"/>
+        </w:rPr>
+        <w:t>demo-new-song</w:t>
+      </w:r>
+      <w:r>
+        <w:rPr>
+          <w:color w:val="243447"/>
+        </w:rPr>
+        <w:t>; never use those on Render.</w:t>
       </w:r>
     </w:p>
     <w:p>
@@ -1694,6 +1885,30 @@
         <w:rPr>
           <w:color w:val="243447"/>
         </w:rPr>
+        <w:t xml:space="preserve">Before that selected session starts, the main control is disabled and says </w:t>
+      </w:r>
+      <w:r>
+        <w:rPr>
+          <w:b/>
+          <w:color w:val="243447"/>
+        </w:rPr>
+        <w:t>Wait for booth time</w:t>
+      </w:r>
+      <w:r>
+        <w:rPr>
+          <w:color w:val="243447"/>
+        </w:rPr>
+        <w:t>. It unlocks only while the same session is live. The server also blocks early, late, and wrong-session updates, so leaders cannot accidentally change attendee screens from the waiting lobby.</w:t>
+      </w:r>
+    </w:p>
+    <w:p>
+      <w:pPr>
+        <w:pStyle w:val="ListBullet"/>
+      </w:pPr>
+      <w:r>
+        <w:rPr>
+          <w:color w:val="243447"/>
+        </w:rPr>
         <w:t xml:space="preserve">In Draw Heaven, Bible Bowl, Art Therapy, and New Song, the fixed control at the bottom tells you what </w:t>
       </w:r>
       <w:r>
@@ -2549,7 +2764,20 @@
         <w:rPr>
           <w:color w:val="243447"/>
         </w:rPr>
-        <w:t xml:space="preserve">Back and Next publish immediately. Tapping a screen in the list also publishes it immediately. The portal automatically follows the clock-current Session 1, Session 2, or extra-booth run; each run keeps independent progress so a late click cannot change the next group. Its recent check-in list remains combined. Use </w:t>
+        <w:t xml:space="preserve">While the current booth session is live, Back and Next publish immediately. Tapping a screen in the list also publishes it immediately. Outside that window, those publish controls are disabled with </w:t>
+      </w:r>
+      <w:r>
+        <w:rPr>
+          <w:b/>
+          <w:color w:val="243447"/>
+        </w:rPr>
+        <w:t>Wait for booth time</w:t>
+      </w:r>
+      <w:r>
+        <w:rPr>
+          <w:color w:val="243447"/>
+        </w:rPr>
+        <w:t xml:space="preserve">. The portal automatically follows the clock-current Session 1, Session 2, or extra-booth run; each run keeps independent progress so a late click cannot change the next group. Its recent check-in list remains combined. Use </w:t>
       </w:r>
       <w:r>
         <w:rPr>
@@ -2664,449 +2892,35 @@
         <w:rPr>
           <w:color w:val="243447"/>
         </w:rPr>
-        <w:t>Give the room time to discuss or guess. Tap Next only when ready to reveal Revelation 14:3 KJV and its artwork.</w:t>
+        <w:t xml:space="preserve">Give the room time to discuss or guess. Tap Next only when ready to reveal </w:t>
+      </w:r>
+      <w:r>
+        <w:rPr>
+          <w:b/>
+          <w:color w:val="243447"/>
+        </w:rPr>
+        <w:t>Revelation 14:3 · NIV</w:t>
+      </w:r>
+      <w:r>
+        <w:rPr>
+          <w:color w:val="243447"/>
+        </w:rPr>
+        <w:t xml:space="preserve"> and its artwork:</w:t>
       </w:r>
     </w:p>
     <w:p>
       <w:pPr>
-        <w:pStyle w:val="ListNumber"/>
-        <w:numPr>
-          <w:ilvl w:val="0"/>
-          <w:numId w:val="15"/>
-        </w:numPr>
+        <w:pStyle w:val="Callout"/>
+        <w:shd w:fill="E8EEF5"/>
+        <w:pBdr>
+          <w:left w:val="single" w:sz="18" w:space="8" w:color="2E74B5"/>
+        </w:pBdr>
       </w:pPr>
       <w:r>
         <w:rPr>
-          <w:color w:val="243447"/>
-        </w:rPr>
-        <w:t xml:space="preserve">Tap Next after the reflection to release </w:t>
-      </w:r>
-      <w:r>
-        <w:rPr>
-          <w:b/>
-          <w:color w:val="243447"/>
-        </w:rPr>
-        <w:t>Finish booth →</w:t>
-      </w:r>
-      <w:r>
-        <w:rPr>
-          <w:color w:val="243447"/>
-        </w:rPr>
-        <w:t>.</w:t>
-      </w:r>
-    </w:p>
-    <w:p>
-      <w:r>
-        <w:rPr>
-          <w:color w:val="243447"/>
-        </w:rPr>
-        <w:t>Votes, results, attendee progress, and archived runs remain separate for each session. Restart after the group clears the booth so the saved run remains available. Session 3 contains only attendees who choose New Song at 4:50.</w:t>
-      </w:r>
-    </w:p>
-    <w:p>
-      <w:pPr>
-        <w:pStyle w:val="Heading1"/>
-      </w:pPr>
-      <w:r>
-        <w:rPr>
-          <w:color w:val="2E74B5"/>
-        </w:rPr>
-        <w:t>6. Google Sheets export</w:t>
-      </w:r>
-    </w:p>
-    <w:p>
-      <w:r>
-        <w:rPr>
-          <w:color w:val="243447"/>
-        </w:rPr>
-        <w:t>The app database is the source of truth; Google Sheets is a live mirror. A Sheet error does not undo a successful registration or booth action.</w:t>
-      </w:r>
-    </w:p>
-    <w:p>
-      <w:pPr>
-        <w:pStyle w:val="Heading2"/>
-      </w:pPr>
-      <w:r>
-        <w:rPr>
-          <w:color w:val="1F4D78"/>
-        </w:rPr>
-        <w:t>During the event</w:t>
-      </w:r>
-    </w:p>
-    <w:p>
-      <w:pPr>
-        <w:pStyle w:val="ListBullet"/>
-      </w:pPr>
-      <w:r>
-        <w:rPr>
-          <w:color w:val="243447"/>
-        </w:rPr>
-        <w:t xml:space="preserve">Once unlocked, Overall Organizer shows </w:t>
-      </w:r>
-      <w:r>
-        <w:rPr>
-          <w:b/>
-          <w:color w:val="243447"/>
-        </w:rPr>
-        <w:t>Not connected</w:t>
-      </w:r>
-      <w:r>
-        <w:rPr>
-          <w:color w:val="243447"/>
-        </w:rPr>
-        <w:t xml:space="preserve">, </w:t>
-      </w:r>
-      <w:r>
-        <w:rPr>
-          <w:b/>
-          <w:color w:val="243447"/>
-        </w:rPr>
-        <w:t>Ready</w:t>
-      </w:r>
-      <w:r>
-        <w:rPr>
-          <w:color w:val="243447"/>
-        </w:rPr>
-        <w:t xml:space="preserve">, </w:t>
-      </w:r>
-      <w:r>
-        <w:rPr>
-          <w:b/>
-          <w:color w:val="243447"/>
-        </w:rPr>
-        <w:t>Queued</w:t>
-      </w:r>
-      <w:r>
-        <w:rPr>
-          <w:color w:val="243447"/>
-        </w:rPr>
-        <w:t xml:space="preserve">, </w:t>
-      </w:r>
-      <w:r>
-        <w:rPr>
-          <w:b/>
-          <w:color w:val="243447"/>
-        </w:rPr>
-        <w:t>Syncing</w:t>
-      </w:r>
-      <w:r>
-        <w:rPr>
-          <w:color w:val="243447"/>
-        </w:rPr>
-        <w:t xml:space="preserve">, </w:t>
-      </w:r>
-      <w:r>
-        <w:rPr>
-          <w:b/>
-          <w:color w:val="243447"/>
-        </w:rPr>
-        <w:t>Up to date</w:t>
-      </w:r>
-      <w:r>
-        <w:rPr>
-          <w:color w:val="243447"/>
-        </w:rPr>
-        <w:t xml:space="preserve">, </w:t>
-      </w:r>
-      <w:r>
-        <w:rPr>
-          <w:b/>
-          <w:color w:val="243447"/>
-        </w:rPr>
-        <w:t>Needs attention</w:t>
-      </w:r>
-      <w:r>
-        <w:rPr>
-          <w:color w:val="243447"/>
-        </w:rPr>
-        <w:t xml:space="preserve">, or </w:t>
-      </w:r>
-      <w:r>
-        <w:rPr>
-          <w:b/>
-          <w:color w:val="243447"/>
-        </w:rPr>
-        <w:t>Unavailable</w:t>
-      </w:r>
-      <w:r>
-        <w:rPr>
-          <w:color w:val="243447"/>
-        </w:rPr>
-        <w:t>.</w:t>
-      </w:r>
-    </w:p>
-    <w:p>
-      <w:pPr>
-        <w:pStyle w:val="ListBullet"/>
-      </w:pPr>
-      <w:r>
-        <w:rPr>
-          <w:b/>
-          <w:color w:val="243447"/>
-        </w:rPr>
-        <w:t>Sync now</w:t>
-      </w:r>
-      <w:r>
-        <w:rPr>
-          <w:color w:val="243447"/>
-        </w:rPr>
-        <w:t xml:space="preserve"> or </w:t>
-      </w:r>
-      <w:r>
-        <w:rPr>
-          <w:b/>
-          <w:color w:val="243447"/>
-        </w:rPr>
-        <w:t>Retry now</w:t>
-      </w:r>
-      <w:r>
-        <w:rPr>
-          <w:color w:val="243447"/>
-        </w:rPr>
-        <w:t xml:space="preserve"> queues an immediate full-snapshot attempt; wait for </w:t>
-      </w:r>
-      <w:r>
-        <w:rPr>
-          <w:b/>
-          <w:color w:val="243447"/>
-        </w:rPr>
-        <w:t>Up to date</w:t>
-      </w:r>
-      <w:r>
-        <w:rPr>
-          <w:color w:val="243447"/>
-        </w:rPr>
-        <w:t>. Failed attempts also retry automatically.</w:t>
-      </w:r>
-    </w:p>
-    <w:p>
-      <w:pPr>
-        <w:pStyle w:val="ListBullet"/>
-      </w:pPr>
-      <w:r>
-        <w:rPr>
-          <w:color w:val="243447"/>
-        </w:rPr>
-        <w:t xml:space="preserve">Each successful sync replaces the managed </w:t>
-      </w:r>
-      <w:r>
-        <w:rPr>
-          <w:rFonts w:ascii="Consolas" w:hAnsi="Consolas"/>
-          <w:color w:val="1F4D78"/>
-          <w:sz w:val="18"/>
-        </w:rPr>
-        <w:t>Live_*</w:t>
-      </w:r>
-      <w:r>
-        <w:rPr>
-          <w:color w:val="243447"/>
-        </w:rPr>
-        <w:t xml:space="preserve"> tabs with the latest app state; it does not append permanent history.</w:t>
-      </w:r>
-    </w:p>
-    <w:p>
-      <w:pPr>
-        <w:pStyle w:val="ListBullet"/>
-      </w:pPr>
-      <w:r>
-        <w:rPr>
-          <w:color w:val="243447"/>
-        </w:rPr>
-        <w:t xml:space="preserve">Phase 3 </w:t>
-      </w:r>
-      <w:r>
-        <w:rPr>
-          <w:b/>
-          <w:color w:val="243447"/>
-        </w:rPr>
-        <w:t>Confirm</w:t>
-      </w:r>
-      <w:r>
-        <w:rPr>
-          <w:color w:val="243447"/>
-        </w:rPr>
-        <w:t xml:space="preserve"> writes </w:t>
-      </w:r>
-      <w:r>
-        <w:rPr>
-          <w:rFonts w:ascii="Consolas" w:hAnsi="Consolas"/>
-          <w:color w:val="1F4D78"/>
-          <w:sz w:val="18"/>
-        </w:rPr>
-        <w:t>TRUE</w:t>
-      </w:r>
-      <w:r>
-        <w:rPr>
-          <w:color w:val="243447"/>
-        </w:rPr>
-        <w:t xml:space="preserve">, </w:t>
-      </w:r>
-      <w:r>
-        <w:rPr>
-          <w:rFonts w:ascii="Consolas" w:hAnsi="Consolas"/>
-          <w:color w:val="1F4D78"/>
-          <w:sz w:val="18"/>
-        </w:rPr>
-        <w:t>staff</w:t>
-      </w:r>
-      <w:r>
-        <w:rPr>
-          <w:color w:val="243447"/>
-        </w:rPr>
-        <w:t xml:space="preserve">, and the event time to </w:t>
-      </w:r>
-      <w:r>
-        <w:rPr>
-          <w:rFonts w:ascii="Consolas" w:hAnsi="Consolas"/>
-          <w:color w:val="1F4D78"/>
-          <w:sz w:val="18"/>
-        </w:rPr>
-        <w:t>Live_SignUps</w:t>
-      </w:r>
-      <w:r>
-        <w:rPr>
-          <w:color w:val="243447"/>
-        </w:rPr>
-        <w:t xml:space="preserve"> columns J–L.</w:t>
-      </w:r>
-    </w:p>
-    <w:p>
-      <w:pPr>
-        <w:pStyle w:val="ListBullet"/>
-      </w:pPr>
-      <w:r>
-        <w:rPr>
-          <w:color w:val="243447"/>
-        </w:rPr>
-        <w:t>Phone numbers are exported in readable formatting. Attendance mode and the optional extra-booth/Connections choice are included with the attendee record. Bible Bowl answers/rankings and New Song votes remain private to their booth portals.</w:t>
-      </w:r>
-    </w:p>
-    <w:p>
-      <w:pPr>
-        <w:pStyle w:val="ListBullet"/>
-      </w:pPr>
-      <w:r>
-        <w:rPr>
-          <w:color w:val="243447"/>
-        </w:rPr>
-        <w:t>Before clearing attendee data, download CSV files or copy the spreadsheet if a historical record is needed.</w:t>
-      </w:r>
-    </w:p>
-    <w:p>
-      <w:r>
-        <w:rPr>
-          <w:color w:val="243447"/>
-        </w:rPr>
-        <w:t xml:space="preserve">Managed tabs are </w:t>
-      </w:r>
-      <w:r>
-        <w:rPr>
-          <w:rFonts w:ascii="Consolas" w:hAnsi="Consolas"/>
-          <w:color w:val="1F4D78"/>
-          <w:sz w:val="18"/>
-        </w:rPr>
-        <w:t>Live_Attendees</w:t>
-      </w:r>
-      <w:r>
-        <w:rPr>
-          <w:color w:val="243447"/>
-        </w:rPr>
-        <w:t xml:space="preserve">, </w:t>
-      </w:r>
-      <w:r>
-        <w:rPr>
-          <w:rFonts w:ascii="Consolas" w:hAnsi="Consolas"/>
-          <w:color w:val="1F4D78"/>
-          <w:sz w:val="18"/>
-        </w:rPr>
-        <w:t>Live_BoothResults</w:t>
-      </w:r>
-      <w:r>
-        <w:rPr>
-          <w:color w:val="243447"/>
-        </w:rPr>
-        <w:t xml:space="preserve">, </w:t>
-      </w:r>
-      <w:r>
-        <w:rPr>
-          <w:rFonts w:ascii="Consolas" w:hAnsi="Consolas"/>
-          <w:color w:val="1F4D78"/>
-          <w:sz w:val="18"/>
-        </w:rPr>
-        <w:t>Live_SignUps</w:t>
-      </w:r>
-      <w:r>
-        <w:rPr>
-          <w:color w:val="243447"/>
-        </w:rPr>
-        <w:t xml:space="preserve">, </w:t>
-      </w:r>
-      <w:r>
-        <w:rPr>
-          <w:rFonts w:ascii="Consolas" w:hAnsi="Consolas"/>
-          <w:color w:val="1F4D78"/>
-          <w:sz w:val="18"/>
-        </w:rPr>
-        <w:t>Live_TriviaAnswers</w:t>
-      </w:r>
-      <w:r>
-        <w:rPr>
-          <w:color w:val="243447"/>
-        </w:rPr>
-        <w:t xml:space="preserve">, </w:t>
-      </w:r>
-      <w:r>
-        <w:rPr>
-          <w:rFonts w:ascii="Consolas" w:hAnsi="Consolas"/>
-          <w:color w:val="1F4D78"/>
-          <w:sz w:val="18"/>
-        </w:rPr>
-        <w:t>Live_HeavenConfirmations</w:t>
-      </w:r>
-      <w:r>
-        <w:rPr>
-          <w:color w:val="243447"/>
-        </w:rPr>
-        <w:t xml:space="preserve">, </w:t>
-      </w:r>
-      <w:r>
-        <w:rPr>
-          <w:rFonts w:ascii="Consolas" w:hAnsi="Consolas"/>
-          <w:color w:val="1F4D78"/>
-          <w:sz w:val="18"/>
-        </w:rPr>
-        <w:t>Live_SongVotes</w:t>
-      </w:r>
-      <w:r>
-        <w:rPr>
-          <w:color w:val="243447"/>
-        </w:rPr>
-        <w:t xml:space="preserve">, and </w:t>
-      </w:r>
-      <w:r>
-        <w:rPr>
-          <w:rFonts w:ascii="Consolas" w:hAnsi="Consolas"/>
-          <w:color w:val="1F4D78"/>
-          <w:sz w:val="18"/>
-        </w:rPr>
-        <w:t>Live_ExportMeta</w:t>
-      </w:r>
-      <w:r>
-        <w:rPr>
-          <w:color w:val="243447"/>
-        </w:rPr>
-        <w:t>. The private trivia and song tabs remain header-only.</w:t>
-      </w:r>
-    </w:p>
-    <w:p>
-      <w:pPr>
-        <w:pStyle w:val="Heading2"/>
-      </w:pPr>
-      <w:r>
-        <w:rPr>
-          <w:color w:val="1F4D78"/>
-        </w:rPr>
-        <w:t>One-time setup for the technical owner</w:t>
+          <w:color w:val="0B2545"/>
+        </w:rPr>
+        <w:t>And they sang a new song before the throne and before the four living creatures and the elders. No one could learn the song except the 144,000 who had been redeemed from the earth.</w:t>
       </w:r>
     </w:p>
     <w:p>
@@ -3121,20 +2935,434 @@
         <w:rPr>
           <w:color w:val="243447"/>
         </w:rPr>
-        <w:t xml:space="preserve">Enable </w:t>
+        <w:t xml:space="preserve">Tap Next after the reflection to release </w:t>
       </w:r>
       <w:r>
         <w:rPr>
           <w:b/>
           <w:color w:val="243447"/>
         </w:rPr>
-        <w:t>Google Sheets API</w:t>
+        <w:t>Finish booth →</w:t>
       </w:r>
       <w:r>
         <w:rPr>
           <w:color w:val="243447"/>
         </w:rPr>
-        <w:t xml:space="preserve"> in the Google Cloud project.</w:t>
+        <w:t>.</w:t>
+      </w:r>
+    </w:p>
+    <w:p>
+      <w:r>
+        <w:rPr>
+          <w:color w:val="243447"/>
+        </w:rPr>
+        <w:t>Votes, results, attendee progress, and archived runs remain separate for each session. Restart after the group clears the booth so the saved run remains available. Session 3 contains only attendees who choose New Song at 4:50.</w:t>
+      </w:r>
+    </w:p>
+    <w:p>
+      <w:pPr>
+        <w:pStyle w:val="Heading1"/>
+      </w:pPr>
+      <w:r>
+        <w:rPr>
+          <w:color w:val="2E74B5"/>
+        </w:rPr>
+        <w:t>6. Google Sheets export</w:t>
+      </w:r>
+    </w:p>
+    <w:p>
+      <w:r>
+        <w:rPr>
+          <w:color w:val="243447"/>
+        </w:rPr>
+        <w:t>The app database is the source of truth; Google Sheets is a live mirror. A Sheet error does not undo a successful registration or booth action.</w:t>
+      </w:r>
+    </w:p>
+    <w:p>
+      <w:pPr>
+        <w:pStyle w:val="Heading2"/>
+      </w:pPr>
+      <w:r>
+        <w:rPr>
+          <w:color w:val="1F4D78"/>
+        </w:rPr>
+        <w:t>During the event</w:t>
+      </w:r>
+    </w:p>
+    <w:p>
+      <w:pPr>
+        <w:pStyle w:val="ListBullet"/>
+      </w:pPr>
+      <w:r>
+        <w:rPr>
+          <w:color w:val="243447"/>
+        </w:rPr>
+        <w:t xml:space="preserve">Once unlocked, Overall Organizer shows </w:t>
+      </w:r>
+      <w:r>
+        <w:rPr>
+          <w:b/>
+          <w:color w:val="243447"/>
+        </w:rPr>
+        <w:t>Not connected</w:t>
+      </w:r>
+      <w:r>
+        <w:rPr>
+          <w:color w:val="243447"/>
+        </w:rPr>
+        <w:t xml:space="preserve">, </w:t>
+      </w:r>
+      <w:r>
+        <w:rPr>
+          <w:b/>
+          <w:color w:val="243447"/>
+        </w:rPr>
+        <w:t>Ready</w:t>
+      </w:r>
+      <w:r>
+        <w:rPr>
+          <w:color w:val="243447"/>
+        </w:rPr>
+        <w:t xml:space="preserve">, </w:t>
+      </w:r>
+      <w:r>
+        <w:rPr>
+          <w:b/>
+          <w:color w:val="243447"/>
+        </w:rPr>
+        <w:t>Queued</w:t>
+      </w:r>
+      <w:r>
+        <w:rPr>
+          <w:color w:val="243447"/>
+        </w:rPr>
+        <w:t xml:space="preserve">, </w:t>
+      </w:r>
+      <w:r>
+        <w:rPr>
+          <w:b/>
+          <w:color w:val="243447"/>
+        </w:rPr>
+        <w:t>Syncing</w:t>
+      </w:r>
+      <w:r>
+        <w:rPr>
+          <w:color w:val="243447"/>
+        </w:rPr>
+        <w:t xml:space="preserve">, </w:t>
+      </w:r>
+      <w:r>
+        <w:rPr>
+          <w:b/>
+          <w:color w:val="243447"/>
+        </w:rPr>
+        <w:t>Up to date</w:t>
+      </w:r>
+      <w:r>
+        <w:rPr>
+          <w:color w:val="243447"/>
+        </w:rPr>
+        <w:t xml:space="preserve">, </w:t>
+      </w:r>
+      <w:r>
+        <w:rPr>
+          <w:b/>
+          <w:color w:val="243447"/>
+        </w:rPr>
+        <w:t>Needs attention</w:t>
+      </w:r>
+      <w:r>
+        <w:rPr>
+          <w:color w:val="243447"/>
+        </w:rPr>
+        <w:t xml:space="preserve">, or </w:t>
+      </w:r>
+      <w:r>
+        <w:rPr>
+          <w:b/>
+          <w:color w:val="243447"/>
+        </w:rPr>
+        <w:t>Unavailable</w:t>
+      </w:r>
+      <w:r>
+        <w:rPr>
+          <w:color w:val="243447"/>
+        </w:rPr>
+        <w:t>.</w:t>
+      </w:r>
+    </w:p>
+    <w:p>
+      <w:pPr>
+        <w:pStyle w:val="ListBullet"/>
+      </w:pPr>
+      <w:r>
+        <w:rPr>
+          <w:b/>
+          <w:color w:val="243447"/>
+        </w:rPr>
+        <w:t>Sync now</w:t>
+      </w:r>
+      <w:r>
+        <w:rPr>
+          <w:color w:val="243447"/>
+        </w:rPr>
+        <w:t xml:space="preserve"> or </w:t>
+      </w:r>
+      <w:r>
+        <w:rPr>
+          <w:b/>
+          <w:color w:val="243447"/>
+        </w:rPr>
+        <w:t>Retry now</w:t>
+      </w:r>
+      <w:r>
+        <w:rPr>
+          <w:color w:val="243447"/>
+        </w:rPr>
+        <w:t xml:space="preserve"> queues an immediate full-snapshot attempt; wait for </w:t>
+      </w:r>
+      <w:r>
+        <w:rPr>
+          <w:b/>
+          <w:color w:val="243447"/>
+        </w:rPr>
+        <w:t>Up to date</w:t>
+      </w:r>
+      <w:r>
+        <w:rPr>
+          <w:color w:val="243447"/>
+        </w:rPr>
+        <w:t>. Failed attempts also retry automatically.</w:t>
+      </w:r>
+    </w:p>
+    <w:p>
+      <w:pPr>
+        <w:pStyle w:val="ListBullet"/>
+      </w:pPr>
+      <w:r>
+        <w:rPr>
+          <w:color w:val="243447"/>
+        </w:rPr>
+        <w:t xml:space="preserve">Each successful sync replaces the managed </w:t>
+      </w:r>
+      <w:r>
+        <w:rPr>
+          <w:rFonts w:ascii="Consolas" w:hAnsi="Consolas"/>
+          <w:color w:val="1F4D78"/>
+          <w:sz w:val="18"/>
+        </w:rPr>
+        <w:t>Live_*</w:t>
+      </w:r>
+      <w:r>
+        <w:rPr>
+          <w:color w:val="243447"/>
+        </w:rPr>
+        <w:t xml:space="preserve"> tabs with the latest app state; it does not append permanent history.</w:t>
+      </w:r>
+    </w:p>
+    <w:p>
+      <w:pPr>
+        <w:pStyle w:val="ListBullet"/>
+      </w:pPr>
+      <w:r>
+        <w:rPr>
+          <w:color w:val="243447"/>
+        </w:rPr>
+        <w:t xml:space="preserve">Phase 3 </w:t>
+      </w:r>
+      <w:r>
+        <w:rPr>
+          <w:b/>
+          <w:color w:val="243447"/>
+        </w:rPr>
+        <w:t>Confirm</w:t>
+      </w:r>
+      <w:r>
+        <w:rPr>
+          <w:color w:val="243447"/>
+        </w:rPr>
+        <w:t xml:space="preserve"> writes </w:t>
+      </w:r>
+      <w:r>
+        <w:rPr>
+          <w:rFonts w:ascii="Consolas" w:hAnsi="Consolas"/>
+          <w:color w:val="1F4D78"/>
+          <w:sz w:val="18"/>
+        </w:rPr>
+        <w:t>TRUE</w:t>
+      </w:r>
+      <w:r>
+        <w:rPr>
+          <w:color w:val="243447"/>
+        </w:rPr>
+        <w:t xml:space="preserve">, </w:t>
+      </w:r>
+      <w:r>
+        <w:rPr>
+          <w:rFonts w:ascii="Consolas" w:hAnsi="Consolas"/>
+          <w:color w:val="1F4D78"/>
+          <w:sz w:val="18"/>
+        </w:rPr>
+        <w:t>staff</w:t>
+      </w:r>
+      <w:r>
+        <w:rPr>
+          <w:color w:val="243447"/>
+        </w:rPr>
+        <w:t xml:space="preserve">, and the event time to </w:t>
+      </w:r>
+      <w:r>
+        <w:rPr>
+          <w:rFonts w:ascii="Consolas" w:hAnsi="Consolas"/>
+          <w:color w:val="1F4D78"/>
+          <w:sz w:val="18"/>
+        </w:rPr>
+        <w:t>Live_SignUps</w:t>
+      </w:r>
+      <w:r>
+        <w:rPr>
+          <w:color w:val="243447"/>
+        </w:rPr>
+        <w:t xml:space="preserve"> columns J–L.</w:t>
+      </w:r>
+    </w:p>
+    <w:p>
+      <w:pPr>
+        <w:pStyle w:val="ListBullet"/>
+      </w:pPr>
+      <w:r>
+        <w:rPr>
+          <w:color w:val="243447"/>
+        </w:rPr>
+        <w:t>Phone numbers are exported in readable formatting. Attendance mode and the optional extra-booth/Connections choice are included with the attendee record. Bible Bowl answers/rankings and New Song votes remain private to their booth portals.</w:t>
+      </w:r>
+    </w:p>
+    <w:p>
+      <w:pPr>
+        <w:pStyle w:val="ListBullet"/>
+      </w:pPr>
+      <w:r>
+        <w:rPr>
+          <w:color w:val="243447"/>
+        </w:rPr>
+        <w:t>Before clearing attendee data, download CSV files or copy the spreadsheet if a historical record is needed.</w:t>
+      </w:r>
+    </w:p>
+    <w:p>
+      <w:r>
+        <w:rPr>
+          <w:color w:val="243447"/>
+        </w:rPr>
+        <w:t xml:space="preserve">Managed tabs are </w:t>
+      </w:r>
+      <w:r>
+        <w:rPr>
+          <w:rFonts w:ascii="Consolas" w:hAnsi="Consolas"/>
+          <w:color w:val="1F4D78"/>
+          <w:sz w:val="18"/>
+        </w:rPr>
+        <w:t>Live_Attendees</w:t>
+      </w:r>
+      <w:r>
+        <w:rPr>
+          <w:color w:val="243447"/>
+        </w:rPr>
+        <w:t xml:space="preserve">, </w:t>
+      </w:r>
+      <w:r>
+        <w:rPr>
+          <w:rFonts w:ascii="Consolas" w:hAnsi="Consolas"/>
+          <w:color w:val="1F4D78"/>
+          <w:sz w:val="18"/>
+        </w:rPr>
+        <w:t>Live_BoothResults</w:t>
+      </w:r>
+      <w:r>
+        <w:rPr>
+          <w:color w:val="243447"/>
+        </w:rPr>
+        <w:t xml:space="preserve">, </w:t>
+      </w:r>
+      <w:r>
+        <w:rPr>
+          <w:rFonts w:ascii="Consolas" w:hAnsi="Consolas"/>
+          <w:color w:val="1F4D78"/>
+          <w:sz w:val="18"/>
+        </w:rPr>
+        <w:t>Live_SignUps</w:t>
+      </w:r>
+      <w:r>
+        <w:rPr>
+          <w:color w:val="243447"/>
+        </w:rPr>
+        <w:t xml:space="preserve">, </w:t>
+      </w:r>
+      <w:r>
+        <w:rPr>
+          <w:rFonts w:ascii="Consolas" w:hAnsi="Consolas"/>
+          <w:color w:val="1F4D78"/>
+          <w:sz w:val="18"/>
+        </w:rPr>
+        <w:t>Live_TriviaAnswers</w:t>
+      </w:r>
+      <w:r>
+        <w:rPr>
+          <w:color w:val="243447"/>
+        </w:rPr>
+        <w:t xml:space="preserve">, </w:t>
+      </w:r>
+      <w:r>
+        <w:rPr>
+          <w:rFonts w:ascii="Consolas" w:hAnsi="Consolas"/>
+          <w:color w:val="1F4D78"/>
+          <w:sz w:val="18"/>
+        </w:rPr>
+        <w:t>Live_HeavenConfirmations</w:t>
+      </w:r>
+      <w:r>
+        <w:rPr>
+          <w:color w:val="243447"/>
+        </w:rPr>
+        <w:t xml:space="preserve">, </w:t>
+      </w:r>
+      <w:r>
+        <w:rPr>
+          <w:rFonts w:ascii="Consolas" w:hAnsi="Consolas"/>
+          <w:color w:val="1F4D78"/>
+          <w:sz w:val="18"/>
+        </w:rPr>
+        <w:t>Live_SongVotes</w:t>
+      </w:r>
+      <w:r>
+        <w:rPr>
+          <w:color w:val="243447"/>
+        </w:rPr>
+        <w:t xml:space="preserve">, and </w:t>
+      </w:r>
+      <w:r>
+        <w:rPr>
+          <w:rFonts w:ascii="Consolas" w:hAnsi="Consolas"/>
+          <w:color w:val="1F4D78"/>
+          <w:sz w:val="18"/>
+        </w:rPr>
+        <w:t>Live_ExportMeta</w:t>
+      </w:r>
+      <w:r>
+        <w:rPr>
+          <w:color w:val="243447"/>
+        </w:rPr>
+        <w:t>. The private trivia and song tabs remain header-only.</w:t>
+      </w:r>
+    </w:p>
+    <w:p>
+      <w:pPr>
+        <w:pStyle w:val="Heading2"/>
+      </w:pPr>
+      <w:r>
+        <w:rPr>
+          <w:color w:val="1F4D78"/>
+        </w:rPr>
+        <w:t>One-time setup for the technical owner</w:t>
       </w:r>
     </w:p>
     <w:p>
@@ -3142,14 +3370,27 @@
         <w:pStyle w:val="ListNumber"/>
         <w:numPr>
           <w:ilvl w:val="0"/>
-          <w:numId w:val="16"/>
+          <w:numId w:val="17"/>
         </w:numPr>
       </w:pPr>
       <w:r>
         <w:rPr>
           <w:color w:val="243447"/>
         </w:rPr>
-        <w:t>Create a service account and download its JSON key.</w:t>
+        <w:t xml:space="preserve">Enable </w:t>
+      </w:r>
+      <w:r>
+        <w:rPr>
+          <w:b/>
+          <w:color w:val="243447"/>
+        </w:rPr>
+        <w:t>Google Sheets API</w:t>
+      </w:r>
+      <w:r>
+        <w:rPr>
+          <w:color w:val="243447"/>
+        </w:rPr>
+        <w:t xml:space="preserve"> in the Google Cloud project.</w:t>
       </w:r>
     </w:p>
     <w:p>
@@ -3157,41 +3398,14 @@
         <w:pStyle w:val="ListNumber"/>
         <w:numPr>
           <w:ilvl w:val="0"/>
-          <w:numId w:val="16"/>
+          <w:numId w:val="17"/>
         </w:numPr>
       </w:pPr>
       <w:r>
         <w:rPr>
           <w:color w:val="243447"/>
         </w:rPr>
-        <w:t xml:space="preserve">Share the destination Sheet with the JSON file's </w:t>
-      </w:r>
-      <w:r>
-        <w:rPr>
-          <w:rFonts w:ascii="Consolas" w:hAnsi="Consolas"/>
-          <w:color w:val="1F4D78"/>
-          <w:sz w:val="18"/>
-        </w:rPr>
-        <w:t>client_email</w:t>
-      </w:r>
-      <w:r>
-        <w:rPr>
-          <w:color w:val="243447"/>
-        </w:rPr>
-        <w:t xml:space="preserve"> as </w:t>
-      </w:r>
-      <w:r>
-        <w:rPr>
-          <w:b/>
-          <w:color w:val="243447"/>
-        </w:rPr>
-        <w:t>Editor</w:t>
-      </w:r>
-      <w:r>
-        <w:rPr>
-          <w:color w:val="243447"/>
-        </w:rPr>
-        <w:t>.</w:t>
+        <w:t>Create a service account and download its JSON key.</w:t>
       </w:r>
     </w:p>
     <w:p>
@@ -3199,14 +3413,14 @@
         <w:pStyle w:val="ListNumber"/>
         <w:numPr>
           <w:ilvl w:val="0"/>
-          <w:numId w:val="16"/>
+          <w:numId w:val="17"/>
         </w:numPr>
       </w:pPr>
       <w:r>
         <w:rPr>
           <w:color w:val="243447"/>
         </w:rPr>
-        <w:t xml:space="preserve">Copy the spreadsheet ID from between </w:t>
+        <w:t xml:space="preserve">Share the destination Sheet with the JSON file's </w:t>
       </w:r>
       <w:r>
         <w:rPr>
@@ -3214,27 +3428,26 @@
           <w:color w:val="1F4D78"/>
           <w:sz w:val="18"/>
         </w:rPr>
-        <w:t>/d/</w:t>
+        <w:t>client_email</w:t>
       </w:r>
       <w:r>
         <w:rPr>
           <w:color w:val="243447"/>
         </w:rPr>
-        <w:t xml:space="preserve"> and </w:t>
-      </w:r>
-      <w:r>
-        <w:rPr>
-          <w:rFonts w:ascii="Consolas" w:hAnsi="Consolas"/>
-          <w:color w:val="1F4D78"/>
-          <w:sz w:val="18"/>
-        </w:rPr>
-        <w:t>/edit</w:t>
-      </w:r>
-      <w:r>
-        <w:rPr>
+        <w:t xml:space="preserve"> as </w:t>
+      </w:r>
+      <w:r>
+        <w:rPr>
+          <w:b/>
           <w:color w:val="243447"/>
         </w:rPr>
-        <w:t xml:space="preserve"> in its URL.</w:t>
+        <w:t>Editor</w:t>
+      </w:r>
+      <w:r>
+        <w:rPr>
+          <w:color w:val="243447"/>
+        </w:rPr>
+        <w:t>.</w:t>
       </w:r>
     </w:p>
     <w:p>
@@ -3242,7 +3455,50 @@
         <w:pStyle w:val="ListNumber"/>
         <w:numPr>
           <w:ilvl w:val="0"/>
-          <w:numId w:val="16"/>
+          <w:numId w:val="17"/>
+        </w:numPr>
+      </w:pPr>
+      <w:r>
+        <w:rPr>
+          <w:color w:val="243447"/>
+        </w:rPr>
+        <w:t xml:space="preserve">Copy the spreadsheet ID from between </w:t>
+      </w:r>
+      <w:r>
+        <w:rPr>
+          <w:rFonts w:ascii="Consolas" w:hAnsi="Consolas"/>
+          <w:color w:val="1F4D78"/>
+          <w:sz w:val="18"/>
+        </w:rPr>
+        <w:t>/d/</w:t>
+      </w:r>
+      <w:r>
+        <w:rPr>
+          <w:color w:val="243447"/>
+        </w:rPr>
+        <w:t xml:space="preserve"> and </w:t>
+      </w:r>
+      <w:r>
+        <w:rPr>
+          <w:rFonts w:ascii="Consolas" w:hAnsi="Consolas"/>
+          <w:color w:val="1F4D78"/>
+          <w:sz w:val="18"/>
+        </w:rPr>
+        <w:t>/edit</w:t>
+      </w:r>
+      <w:r>
+        <w:rPr>
+          <w:color w:val="243447"/>
+        </w:rPr>
+        <w:t xml:space="preserve"> in its URL.</w:t>
+      </w:r>
+    </w:p>
+    <w:p>
+      <w:pPr>
+        <w:pStyle w:val="ListNumber"/>
+        <w:numPr>
+          <w:ilvl w:val="0"/>
+          <w:numId w:val="17"/>
         </w:numPr>
       </w:pPr>
       <w:r>
@@ -3328,7 +3584,35 @@
         <w:rPr>
           <w:color w:val="243447"/>
         </w:rPr>
-        <w:t xml:space="preserve"> are not used. Never put the JSON key in GitHub, Slack, or browser code.</w:t>
+        <w:t xml:space="preserve"> are not used while </w:t>
+      </w:r>
+      <w:r>
+        <w:rPr>
+          <w:rFonts w:ascii="Consolas" w:hAnsi="Consolas"/>
+          <w:color w:val="1F4D78"/>
+          <w:sz w:val="18"/>
+        </w:rPr>
+        <w:t>web/shared/config.js</w:t>
+      </w:r>
+      <w:r>
+        <w:rPr>
+          <w:color w:val="243447"/>
+        </w:rPr>
+        <w:t xml:space="preserve"> points to </w:t>
+      </w:r>
+      <w:r>
+        <w:rPr>
+          <w:rFonts w:ascii="Consolas" w:hAnsi="Consolas"/>
+          <w:color w:val="1F4D78"/>
+          <w:sz w:val="18"/>
+        </w:rPr>
+        <w:t>/api</w:t>
+      </w:r>
+      <w:r>
+        <w:rPr>
+          <w:color w:val="243447"/>
+        </w:rPr>
+        <w:t>; the old adapter retains a legacy single-key model but is not part of this deployment. Never put the JSON key in GitHub, Slack, or browser code.</w:t>
       </w:r>
     </w:p>
     <w:p>
@@ -3347,7 +3631,7 @@
         <w:pStyle w:val="ListNumber"/>
         <w:numPr>
           <w:ilvl w:val="0"/>
-          <w:numId w:val="17"/>
+          <w:numId w:val="18"/>
         </w:numPr>
       </w:pPr>
       <w:r>
@@ -3362,7 +3646,7 @@
         <w:pStyle w:val="ListNumber"/>
         <w:numPr>
           <w:ilvl w:val="0"/>
-          <w:numId w:val="17"/>
+          <w:numId w:val="18"/>
         </w:numPr>
       </w:pPr>
       <w:r>
@@ -3390,7 +3674,7 @@
         <w:pStyle w:val="ListNumber"/>
         <w:numPr>
           <w:ilvl w:val="0"/>
-          <w:numId w:val="17"/>
+          <w:numId w:val="18"/>
         </w:numPr>
       </w:pPr>
       <w:r>
@@ -3418,14 +3702,14 @@
         <w:pStyle w:val="ListNumber"/>
         <w:numPr>
           <w:ilvl w:val="0"/>
-          <w:numId w:val="17"/>
+          <w:numId w:val="18"/>
         </w:numPr>
       </w:pPr>
       <w:r>
         <w:rPr>
           <w:color w:val="243447"/>
         </w:rPr>
-        <w:t>Have each booth leader unlock their portal and confirm Session 1's wristband color.</w:t>
+        <w:t>Have each booth leader unlock their portal with that booth's password and confirm Session 1's wristband color.</w:t>
       </w:r>
     </w:p>
     <w:p>
@@ -3433,14 +3717,27 @@
         <w:pStyle w:val="ListNumber"/>
         <w:numPr>
           <w:ilvl w:val="0"/>
-          <w:numId w:val="17"/>
+          <w:numId w:val="18"/>
         </w:numPr>
       </w:pPr>
       <w:r>
         <w:rPr>
           <w:color w:val="243447"/>
         </w:rPr>
-        <w:t>Leave attendees on the welcome/lobby screen until 3:35.</w:t>
+        <w:t xml:space="preserve">Leave attendees on the welcome/lobby screen until 3:35. Confirm each leader's main control says </w:t>
+      </w:r>
+      <w:r>
+        <w:rPr>
+          <w:b/>
+          <w:color w:val="243447"/>
+        </w:rPr>
+        <w:t>Wait for booth time</w:t>
+      </w:r>
+      <w:r>
+        <w:rPr>
+          <w:color w:val="243447"/>
+        </w:rPr>
+        <w:t xml:space="preserve"> and cannot be tapped early.</w:t>
       </w:r>
     </w:p>
     <w:p>
@@ -3448,7 +3745,7 @@
         <w:pStyle w:val="ListNumber"/>
         <w:numPr>
           <w:ilvl w:val="0"/>
-          <w:numId w:val="17"/>
+          <w:numId w:val="18"/>
         </w:numPr>
       </w:pPr>
       <w:r>
@@ -3463,7 +3760,7 @@
         <w:pStyle w:val="ListNumber"/>
         <w:numPr>
           <w:ilvl w:val="0"/>
-          <w:numId w:val="17"/>
+          <w:numId w:val="18"/>
         </w:numPr>
       </w:pPr>
       <w:r>
@@ -3485,7 +3782,7 @@
         <w:pStyle w:val="ListNumber"/>
         <w:numPr>
           <w:ilvl w:val="0"/>
-          <w:numId w:val="17"/>
+          <w:numId w:val="18"/>
         </w:numPr>
       </w:pPr>
       <w:r>
@@ -3500,7 +3797,7 @@
         <w:pStyle w:val="ListNumber"/>
         <w:numPr>
           <w:ilvl w:val="0"/>
-          <w:numId w:val="17"/>
+          <w:numId w:val="18"/>
         </w:numPr>
       </w:pPr>
       <w:r>
@@ -3515,7 +3812,7 @@
         <w:pStyle w:val="ListNumber"/>
         <w:numPr>
           <w:ilvl w:val="0"/>
-          <w:numId w:val="17"/>
+          <w:numId w:val="18"/>
         </w:numPr>
       </w:pPr>
       <w:r>
@@ -3545,13 +3842,13 @@
           <w:b/>
           <w:color w:val="243447"/>
         </w:rPr>
-        <w:t>Next did not change phones:</w:t>
+        <w:t>The control says Wait for booth time:</w:t>
       </w:r>
       <w:r>
         <w:rPr>
           <w:color w:val="243447"/>
         </w:rPr>
-        <w:t xml:space="preserve"> wait a few seconds, confirm you are controlling the live session, and use Refresh. If the button says Switch to Session, switch first and then tap Next.</w:t>
+        <w:t xml:space="preserve"> this is expected until the selected session is live. Check the shared clock and selected session; do not try to pre-publish from the lobby.</w:t>
       </w:r>
     </w:p>
     <w:p>
@@ -3563,13 +3860,13 @@
           <w:b/>
           <w:color w:val="243447"/>
         </w:rPr>
-        <w:t>An attendee cannot enter:</w:t>
+        <w:t>Next did not change phones:</w:t>
       </w:r>
       <w:r>
         <w:rPr>
           <w:color w:val="243447"/>
         </w:rPr>
-        <w:t xml:space="preserve"> check their wristband, current time, and late-arrival status. Off-route rooms are intentionally locked.</w:t>
+        <w:t xml:space="preserve"> wait a few seconds, confirm you are controlling the live session, and use Refresh. If the button says Switch to Session, switch first and then tap Next.</w:t>
       </w:r>
     </w:p>
     <w:p>
@@ -3581,13 +3878,13 @@
           <w:b/>
           <w:color w:val="243447"/>
         </w:rPr>
-        <w:t>An attendee refreshed:</w:t>
+        <w:t>An attendee cannot enter:</w:t>
       </w:r>
       <w:r>
         <w:rPr>
           <w:color w:val="243447"/>
         </w:rPr>
-        <w:t xml:space="preserve"> their position should restore. On a new device, they sign in with the same name and phone number.</w:t>
+        <w:t xml:space="preserve"> check their wristband, current time, and late-arrival status. Off-route rooms are intentionally locked.</w:t>
       </w:r>
     </w:p>
     <w:p>
@@ -3599,13 +3896,49 @@
           <w:b/>
           <w:color w:val="243447"/>
         </w:rPr>
-        <w:t>A staff refresh asks for the key again:</w:t>
+        <w:t>An attendee refreshed:</w:t>
       </w:r>
       <w:r>
         <w:rPr>
           <w:color w:val="243447"/>
         </w:rPr>
-        <w:t xml:space="preserve"> re-enter the organizer key; staff access is remembered only for the current page session.</w:t>
+        <w:t xml:space="preserve"> their position should restore. On a new device, they sign in with the same name and phone number.</w:t>
+      </w:r>
+    </w:p>
+    <w:p>
+      <w:pPr>
+        <w:pStyle w:val="ListBullet"/>
+      </w:pPr>
+      <w:r>
+        <w:rPr>
+          <w:b/>
+          <w:color w:val="243447"/>
+        </w:rPr>
+        <w:t>A staff refresh asks for a password again:</w:t>
+      </w:r>
+      <w:r>
+        <w:rPr>
+          <w:color w:val="243447"/>
+        </w:rPr>
+        <w:t xml:space="preserve"> re-enter that role's password; staff access is remembered only for the current page session.</w:t>
+      </w:r>
+    </w:p>
+    <w:p>
+      <w:pPr>
+        <w:pStyle w:val="ListBullet"/>
+      </w:pPr>
+      <w:r>
+        <w:rPr>
+          <w:b/>
+          <w:color w:val="243447"/>
+        </w:rPr>
+        <w:t>A password opens the wrong portal or no portal:</w:t>
+      </w:r>
+      <w:r>
+        <w:rPr>
+          <w:color w:val="243447"/>
+        </w:rPr>
+        <w:t xml:space="preserve"> each value must be unique and mapped to the exact Render variable above. There is no Overall-password fallback for booths.</w:t>
       </w:r>
     </w:p>
     <w:p>
@@ -3963,10 +4296,16 @@
   <w:num w:numId="16">
     <w:abstractNumId w:val="7"/>
     <w:lvlOverride w:ilvl="0">
+      <w:startOverride w:val="5"/>
+    </w:lvlOverride>
+  </w:num>
+  <w:num w:numId="17">
+    <w:abstractNumId w:val="7"/>
+    <w:lvlOverride w:ilvl="0">
       <w:startOverride w:val="1"/>
     </w:lvlOverride>
   </w:num>
-  <w:num w:numId="17">
+  <w:num w:numId="18">
     <w:abstractNumId w:val="7"/>
     <w:lvlOverride w:ilvl="0">
       <w:startOverride w:val="1"/>

</xml_diff>